<commit_message>
fixed the freeze and upload aga
</commit_message>
<xml_diff>
--- a/docs/homeworks/hw_01/homework.docx
+++ b/docs/homeworks/hw_01/homework.docx
@@ -24,14 +24,6 @@
       </w:pPr>
       <w:r>
         <w:t xml:space="preserve">Name: _________________________________ | Date: _____________</w:t>
-      </w:r>
-    </w:p>
-    <w:p>
-      <w:pPr>
-        <w:pStyle w:val="Date"/>
-      </w:pPr>
-      <w:r>
-        <w:t xml:space="preserve">2026-07-02</w:t>
       </w:r>
     </w:p>
     <w:p>

</xml_diff>